<commit_message>
docs(arch): re-export report to Word and PDF
Co-Authored-By: Claude Opus 5.5 <noreply@anthropic.com>
</commit_message>
<xml_diff>
--- a/docs/architecture/FinPilot_Architecture_Report.docx
+++ b/docs/architecture/FinPilot_Architecture_Report.docx
@@ -23,7 +23,7 @@
         <w:t>Scope of this report.</w:t>
       </w:r>
       <w:r>
-        <w:t xml:space="preserve"> The API, database, import pipeline, tests, container images, compose stack, TLS proxy and both CI workflows are described from the code on </w:t>
+        <w:t xml:space="preserve"> Everything described here is built and on </w:t>
       </w:r>
       <w:r>
         <w:rPr>
@@ -33,16 +33,7 @@
         <w:t>main</w:t>
       </w:r>
       <w:r>
-        <w:t xml:space="preserve">. The Next.js web app was still being built when this was written, so it is described as the agreed design and marked </w:t>
-      </w:r>
-      <w:r>
-        <w:rPr>
-          <w:i/>
-        </w:rPr>
-        <w:t>(design)</w:t>
-      </w:r>
-      <w:r>
-        <w:t xml:space="preserve">. Companion documents: </w:t>
+        <w:t xml:space="preserve">: API, database, import pipeline, Next.js web app, tests, container images, compose stack, TLS proxy and both CI workflows. The full stack passed a 30-check end-to-end run through the web origin. Companion documents: </w:t>
       </w:r>
       <w:r>
         <w:rPr>
@@ -123,16 +114,7 @@
         <w:t>Stack.</w:t>
       </w:r>
       <w:r>
-        <w:t xml:space="preserve"> PostgreSQL 16 · Python 3.12, FastAPI, Pydantic v2, SQLAlchemy 2 async + asyncpg, Alembic · Argon2id + HS256 JWT in an HttpOnly cookie · Next.js 15, TypeScript, Tailwind, shadcn/ui, TanStack Query, React Hook Form + Zod, Recharts </w:t>
-      </w:r>
-      <w:r>
-        <w:rPr>
-          <w:i/>
-        </w:rPr>
-        <w:t>(design)</w:t>
-      </w:r>
-      <w:r>
-        <w:t xml:space="preserve"> · Docker Compose with an optional Caddy TLS proxy · GitHub Actions.</w:t>
+        <w:t xml:space="preserve"> PostgreSQL 16 · Python 3.12, FastAPI, Pydantic v2, SQLAlchemy 2 async + asyncpg, Alembic · Argon2id + HS256 JWT in an HttpOnly cookie · Next.js 15.5 App Router, TypeScript strict, Tailwind + shadcn/ui (Radix), TanStack Query v5, React Hook Form + Zod, Recharts · Docker Compose with an optional Caddy TLS proxy · GitHub Actions.</w:t>
       </w:r>
     </w:p>
     <w:p>
@@ -932,19 +914,170 @@
         <w:rPr>
           <w:b/>
         </w:rPr>
-        <w:t>Frontend modules</w:t>
-      </w:r>
-      <w:r>
-        <w:t xml:space="preserve"> </w:t>
+        <w:t>Frontend (apps/web).</w:t>
+      </w:r>
+      <w:r>
+        <w:t xml:space="preserve"> Thin route files in </w:t>
       </w:r>
       <w:r>
         <w:rPr>
-          <w:i/>
+          <w:rFonts w:ascii="Consolas" w:hAnsi="Consolas"/>
+          <w:color w:val="8B1A1A"/>
         </w:rPr>
-        <w:t>(design)</w:t>
+        <w:t>app/</w:t>
       </w:r>
       <w:r>
         <w:t xml:space="preserve">: </w:t>
+      </w:r>
+      <w:r>
+        <w:rPr>
+          <w:rFonts w:ascii="Consolas" w:hAnsi="Consolas"/>
+          <w:color w:val="8B1A1A"/>
+        </w:rPr>
+        <w:t>/login</w:t>
+      </w:r>
+      <w:r>
+        <w:t xml:space="preserve">, </w:t>
+      </w:r>
+      <w:r>
+        <w:rPr>
+          <w:rFonts w:ascii="Consolas" w:hAnsi="Consolas"/>
+          <w:color w:val="8B1A1A"/>
+        </w:rPr>
+        <w:t>/</w:t>
+      </w:r>
+      <w:r>
+        <w:t xml:space="preserve"> overview, </w:t>
+      </w:r>
+      <w:r>
+        <w:rPr>
+          <w:rFonts w:ascii="Consolas" w:hAnsi="Consolas"/>
+          <w:color w:val="8B1A1A"/>
+        </w:rPr>
+        <w:t>/customers</w:t>
+      </w:r>
+      <w:r>
+        <w:t xml:space="preserve">, </w:t>
+      </w:r>
+      <w:r>
+        <w:rPr>
+          <w:rFonts w:ascii="Consolas" w:hAnsi="Consolas"/>
+          <w:color w:val="8B1A1A"/>
+        </w:rPr>
+        <w:t>/customers/[id]</w:t>
+      </w:r>
+      <w:r>
+        <w:t xml:space="preserve"> (+ </w:t>
+      </w:r>
+      <w:r>
+        <w:rPr>
+          <w:rFonts w:ascii="Consolas" w:hAnsi="Consolas"/>
+          <w:color w:val="8B1A1A"/>
+        </w:rPr>
+        <w:t>/portfolio</w:t>
+      </w:r>
+      <w:r>
+        <w:t xml:space="preserve">, </w:t>
+      </w:r>
+      <w:r>
+        <w:rPr>
+          <w:rFonts w:ascii="Consolas" w:hAnsi="Consolas"/>
+          <w:color w:val="8B1A1A"/>
+        </w:rPr>
+        <w:t>/transactions</w:t>
+      </w:r>
+      <w:r>
+        <w:t xml:space="preserve">, </w:t>
+      </w:r>
+      <w:r>
+        <w:rPr>
+          <w:rFonts w:ascii="Consolas" w:hAnsi="Consolas"/>
+          <w:color w:val="8B1A1A"/>
+        </w:rPr>
+        <w:t>/goals</w:t>
+      </w:r>
+      <w:r>
+        <w:t xml:space="preserve">), </w:t>
+      </w:r>
+      <w:r>
+        <w:rPr>
+          <w:rFonts w:ascii="Consolas" w:hAnsi="Consolas"/>
+          <w:color w:val="8B1A1A"/>
+        </w:rPr>
+        <w:t>/admin/import</w:t>
+      </w:r>
+      <w:r>
+        <w:t>. Feature folders (</w:t>
+      </w:r>
+      <w:r>
+        <w:rPr>
+          <w:rFonts w:ascii="Consolas" w:hAnsi="Consolas"/>
+          <w:color w:val="8B1A1A"/>
+        </w:rPr>
+        <w:t>auth</w:t>
+      </w:r>
+      <w:r>
+        <w:t xml:space="preserve">, </w:t>
+      </w:r>
+      <w:r>
+        <w:rPr>
+          <w:rFonts w:ascii="Consolas" w:hAnsi="Consolas"/>
+          <w:color w:val="8B1A1A"/>
+        </w:rPr>
+        <w:t>customers</w:t>
+      </w:r>
+      <w:r>
+        <w:t xml:space="preserve">, </w:t>
+      </w:r>
+      <w:r>
+        <w:rPr>
+          <w:rFonts w:ascii="Consolas" w:hAnsi="Consolas"/>
+          <w:color w:val="8B1A1A"/>
+        </w:rPr>
+        <w:t>overview</w:t>
+      </w:r>
+      <w:r>
+        <w:t xml:space="preserve">, </w:t>
+      </w:r>
+      <w:r>
+        <w:rPr>
+          <w:rFonts w:ascii="Consolas" w:hAnsi="Consolas"/>
+          <w:color w:val="8B1A1A"/>
+        </w:rPr>
+        <w:t>portfolio</w:t>
+      </w:r>
+      <w:r>
+        <w:t xml:space="preserve">, </w:t>
+      </w:r>
+      <w:r>
+        <w:rPr>
+          <w:rFonts w:ascii="Consolas" w:hAnsi="Consolas"/>
+          <w:color w:val="8B1A1A"/>
+        </w:rPr>
+        <w:t>transactions</w:t>
+      </w:r>
+      <w:r>
+        <w:t xml:space="preserve">, </w:t>
+      </w:r>
+      <w:r>
+        <w:rPr>
+          <w:rFonts w:ascii="Consolas" w:hAnsi="Consolas"/>
+          <w:color w:val="8B1A1A"/>
+        </w:rPr>
+        <w:t>goals</w:t>
+      </w:r>
+      <w:r>
+        <w:t xml:space="preserve">, </w:t>
+      </w:r>
+      <w:r>
+        <w:rPr>
+          <w:rFonts w:ascii="Consolas" w:hAnsi="Consolas"/>
+          <w:color w:val="8B1A1A"/>
+        </w:rPr>
+        <w:t>imports</w:t>
+      </w:r>
+      <w:r>
+        <w:t xml:space="preserve">) each own typed API calls, TanStack Query hooks with query-key factories, types generated from the OpenAPI spec, and components. </w:t>
       </w:r>
       <w:r>
         <w:rPr>
@@ -954,157 +1087,57 @@
         <w:t>middleware.ts</w:t>
       </w:r>
       <w:r>
-        <w:t xml:space="preserve"> route guard (no session cookie -&gt; </w:t>
+        <w:t xml:space="preserve"> redirects cookie-less requests to </w:t>
       </w:r>
       <w:r>
         <w:rPr>
           <w:rFonts w:ascii="Consolas" w:hAnsi="Consolas"/>
           <w:color w:val="8B1A1A"/>
         </w:rPr>
-        <w:t>/login</w:t>
-      </w:r>
-      <w:r>
-        <w:t xml:space="preserve">; the API still enforces auth); routes </w:t>
+        <w:t>/login?next=...</w:t>
+      </w:r>
+      <w:r>
+        <w:t xml:space="preserve"> (the API still enforces auth); any 401 clears the query cache and returns to login; the </w:t>
       </w:r>
       <w:r>
         <w:rPr>
           <w:rFonts w:ascii="Consolas" w:hAnsi="Consolas"/>
           <w:color w:val="8B1A1A"/>
         </w:rPr>
-        <w:t>/login</w:t>
-      </w:r>
-      <w:r>
-        <w:t xml:space="preserve">, </w:t>
+        <w:t>next</w:t>
+      </w:r>
+      <w:r>
+        <w:t xml:space="preserve"> target is validated by </w:t>
       </w:r>
       <w:r>
         <w:rPr>
           <w:rFonts w:ascii="Consolas" w:hAnsi="Consolas"/>
           <w:color w:val="8B1A1A"/>
         </w:rPr>
-        <w:t>/</w:t>
-      </w:r>
-      <w:r>
-        <w:t xml:space="preserve"> overview, </w:t>
+        <w:t>safeNextPath</w:t>
+      </w:r>
+      <w:r>
+        <w:t xml:space="preserve"> (same-origin only; backslashes and control characters rejected), so it cannot be used as an open redirect. Filters, sort and pagination live in the URL; forms use React Hook Form + Zod mirroring the API rules and map API 422 </w:t>
       </w:r>
       <w:r>
         <w:rPr>
           <w:rFonts w:ascii="Consolas" w:hAnsi="Consolas"/>
           <w:color w:val="8B1A1A"/>
         </w:rPr>
-        <w:t>/customers</w:t>
-      </w:r>
-      <w:r>
-        <w:t xml:space="preserve">, </w:t>
+        <w:t>details[].field</w:t>
+      </w:r>
+      <w:r>
+        <w:t xml:space="preserve"> errors onto inputs; every section has its own loading, empty and error state (showing the </w:t>
       </w:r>
       <w:r>
         <w:rPr>
           <w:rFonts w:ascii="Consolas" w:hAnsi="Consolas"/>
           <w:color w:val="8B1A1A"/>
         </w:rPr>
-        <w:t>/customers/[id]</w:t>
-      </w:r>
-      <w:r>
-        <w:t xml:space="preserve"> (overview/portfolio/transactions/goals tabs), </w:t>
-      </w:r>
-      <w:r>
-        <w:rPr>
-          <w:rFonts w:ascii="Consolas" w:hAnsi="Consolas"/>
-          <w:color w:val="8B1A1A"/>
-        </w:rPr>
-        <w:t>/admin/import</w:t>
-      </w:r>
-      <w:r>
-        <w:t xml:space="preserve">; feature folders </w:t>
-      </w:r>
-      <w:r>
-        <w:rPr>
-          <w:rFonts w:ascii="Consolas" w:hAnsi="Consolas"/>
-          <w:color w:val="8B1A1A"/>
-        </w:rPr>
-        <w:t>auth</w:t>
-      </w:r>
-      <w:r>
-        <w:t xml:space="preserve">, </w:t>
-      </w:r>
-      <w:r>
-        <w:rPr>
-          <w:rFonts w:ascii="Consolas" w:hAnsi="Consolas"/>
-          <w:color w:val="8B1A1A"/>
-        </w:rPr>
-        <w:t>customers</w:t>
-      </w:r>
-      <w:r>
-        <w:t xml:space="preserve">, </w:t>
-      </w:r>
-      <w:r>
-        <w:rPr>
-          <w:rFonts w:ascii="Consolas" w:hAnsi="Consolas"/>
-          <w:color w:val="8B1A1A"/>
-        </w:rPr>
-        <w:t>portfolio</w:t>
-      </w:r>
-      <w:r>
-        <w:t xml:space="preserve">, </w:t>
-      </w:r>
-      <w:r>
-        <w:rPr>
-          <w:rFonts w:ascii="Consolas" w:hAnsi="Consolas"/>
-          <w:color w:val="8B1A1A"/>
-        </w:rPr>
-        <w:t>transactions</w:t>
-      </w:r>
-      <w:r>
-        <w:t xml:space="preserve">, </w:t>
-      </w:r>
-      <w:r>
-        <w:rPr>
-          <w:rFonts w:ascii="Consolas" w:hAnsi="Consolas"/>
-          <w:color w:val="8B1A1A"/>
-        </w:rPr>
-        <w:t>goals</w:t>
-      </w:r>
-      <w:r>
-        <w:t xml:space="preserve">, </w:t>
-      </w:r>
-      <w:r>
-        <w:rPr>
-          <w:rFonts w:ascii="Consolas" w:hAnsi="Consolas"/>
-          <w:color w:val="8B1A1A"/>
-        </w:rPr>
-        <w:t>imports</w:t>
-      </w:r>
-      <w:r>
-        <w:t xml:space="preserve">, </w:t>
-      </w:r>
-      <w:r>
-        <w:rPr>
-          <w:rFonts w:ascii="Consolas" w:hAnsi="Consolas"/>
-          <w:color w:val="8B1A1A"/>
-        </w:rPr>
-        <w:t>overview</w:t>
-      </w:r>
-      <w:r>
-        <w:t xml:space="preserve">, each owning its query hooks, components and Zod schemas; a typed </w:t>
-      </w:r>
-      <w:r>
-        <w:rPr>
-          <w:rFonts w:ascii="Consolas" w:hAnsi="Consolas"/>
-          <w:color w:val="8B1A1A"/>
-        </w:rPr>
-        <w:t>lib/api</w:t>
-      </w:r>
-      <w:r>
-        <w:t xml:space="preserve"> client calling same-origin </w:t>
-      </w:r>
-      <w:r>
-        <w:rPr>
-          <w:rFonts w:ascii="Consolas" w:hAnsi="Consolas"/>
-          <w:color w:val="8B1A1A"/>
-        </w:rPr>
-        <w:t>/api/v1/*</w:t>
-      </w:r>
-      <w:r>
-        <w:t xml:space="preserve"> and mapping the error envelope; TanStack Query for all server state; ledger filters in the URL.</w:t>
+        <w:t>request_id</w:t>
+      </w:r>
+      <w:r>
+        <w:t>). The browser only formats numbers, it never computes financial figures. 55 Vitest tests.</w:t>
       </w:r>
     </w:p>
     <w:p>
@@ -4231,7 +4264,7 @@
       <w:r>
         <w:drawing>
           <wp:inline xmlns:a="http://schemas.openxmlformats.org/drawingml/2006/main" xmlns:pic="http://schemas.openxmlformats.org/drawingml/2006/picture">
-            <wp:extent cx="4473457" cy="3611880"/>
+            <wp:extent cx="4417211" cy="3611880"/>
             <wp:docPr id="3" name="Picture 3"/>
             <wp:cNvGraphicFramePr>
               <a:graphicFrameLocks noChangeAspect="1"/>
@@ -4252,7 +4285,7 @@
                   <pic:spPr>
                     <a:xfrm>
                       <a:off x="0" y="0"/>
-                      <a:ext cx="4473457" cy="3611880"/>
+                      <a:ext cx="4417211" cy="3611880"/>
                     </a:xfrm>
                     <a:prstGeom prst="rect"/>
                   </pic:spPr>
@@ -4514,7 +4547,7 @@
       <w:r>
         <w:drawing>
           <wp:inline xmlns:a="http://schemas.openxmlformats.org/drawingml/2006/main" xmlns:pic="http://schemas.openxmlformats.org/drawingml/2006/picture">
-            <wp:extent cx="6492240" cy="1623950"/>
+            <wp:extent cx="6492240" cy="1581215"/>
             <wp:docPr id="7" name="Picture 7"/>
             <wp:cNvGraphicFramePr>
               <a:graphicFrameLocks noChangeAspect="1"/>
@@ -4535,7 +4568,7 @@
                   <pic:spPr>
                     <a:xfrm>
                       <a:off x="0" y="0"/>
-                      <a:ext cx="6492240" cy="1623950"/>
+                      <a:ext cx="6492240" cy="1581215"/>
                     </a:xfrm>
                     <a:prstGeom prst="rect"/>
                   </pic:spPr>
@@ -4647,13 +4680,34 @@
         <w:t>/health</w:t>
       </w:r>
       <w:r>
-        <w:t xml:space="preserve"> reports the database healthy, demo login returns 200). A web lint/typecheck/test job is </w:t>
+        <w:t xml:space="preserve"> reports the database healthy, demo login returns 200). The </w:t>
       </w:r>
       <w:r>
         <w:rPr>
-          <w:i/>
+          <w:rFonts w:ascii="Consolas" w:hAnsi="Consolas"/>
+          <w:color w:val="8B1A1A"/>
         </w:rPr>
-        <w:t>(design)</w:t>
+        <w:t>web</w:t>
+      </w:r>
+      <w:r>
+        <w:t xml:space="preserve"> job runs </w:t>
+      </w:r>
+      <w:r>
+        <w:rPr>
+          <w:rFonts w:ascii="Consolas" w:hAnsi="Consolas"/>
+          <w:color w:val="8B1A1A"/>
+        </w:rPr>
+        <w:t>npm ci</w:t>
+      </w:r>
+      <w:r>
+        <w:t xml:space="preserve">, lint, typecheck, Vitest and </w:t>
+      </w:r>
+      <w:r>
+        <w:rPr>
+          <w:rFonts w:ascii="Consolas" w:hAnsi="Consolas"/>
+          <w:color w:val="8B1A1A"/>
+        </w:rPr>
+        <w:t>next build</w:t>
       </w:r>
       <w:r>
         <w:t xml:space="preserve">. Deployment is </w:t>
@@ -5001,7 +5055,21 @@
               <w:rPr>
                 <w:sz w:val="16"/>
               </w:rPr>
-              <w:t xml:space="preserve">. </w:t>
+              <w:t xml:space="preserve">, trusting forwarded headers only from </w:t>
+            </w:r>
+            <w:r>
+              <w:rPr>
+                <w:rFonts w:ascii="Consolas" w:hAnsi="Consolas"/>
+                <w:color w:val="8B1A1A"/>
+                <w:sz w:val="16"/>
+              </w:rPr>
+              <w:t>FORWARDED_ALLOW_IPS</w:t>
+            </w:r>
+            <w:r>
+              <w:rPr>
+                <w:sz w:val="16"/>
+              </w:rPr>
+              <w:t xml:space="preserve"> (default 127.0.0.1). </w:t>
             </w:r>
             <w:r>
               <w:rPr>
@@ -5408,7 +5476,17 @@
         <w:t>Production mapping:</w:t>
       </w:r>
       <w:r>
-        <w:t xml:space="preserve"> managed PostgreSQL 16 (Multi-AZ, automated backups + PITR, private subnet, TLS); the same API/web images on a container platform behind a managed load balancer with real certificates and SSO in front; migrations as a one-off release job (</w:t>
+        <w:t xml:space="preserve"> managed PostgreSQL 16 (Multi-AZ, PITR, private subnet, TLS); the same images on a container platform behind a load balancer that terminates TLS and overwrites </w:t>
+      </w:r>
+      <w:r>
+        <w:rPr>
+          <w:rFonts w:ascii="Consolas" w:hAnsi="Consolas"/>
+          <w:color w:val="8B1A1A"/>
+        </w:rPr>
+        <w:t>X-Forwarded-For</w:t>
+      </w:r>
+      <w:r>
+        <w:t>; migrations as a release job (</w:t>
       </w:r>
       <w:r>
         <w:rPr>
@@ -5418,7 +5496,7 @@
         <w:t>SEED_ON_START=false</w:t>
       </w:r>
       <w:r>
-        <w:t>); secrets from a secrets manager; separate DB roles for DDL (migrations) and DML (runtime); logs shipped to a central store.</w:t>
+        <w:t>); secrets manager; separate DDL/DML database roles; central log store.</w:t>
       </w:r>
     </w:p>
     <w:p>
@@ -5508,7 +5586,7 @@
               <w:rPr>
                 <w:sz w:val="16"/>
               </w:rPr>
-              <w:t>Argon2id hashes (rehashed on login when parameters change). Identical 401 for unknown user, wrong password and inactive user; a dummy hash is verified for unknown e-mails to equalise timing. Login limit 5 attempts / 60 s per client IP + e-mail, held in memory per uvicorn worker</w:t>
+              <w:t>Argon2id hashes (rehashed on login when parameters change). Identical 401 for unknown user, wrong password and inactive user; a dummy hash is verified for unknown e-mails to equalise timing. Two login budgets, both charged on every attempt: 5 / 60 s per (client IP, e-mail) and 10 / 60 s per e-mail. The second cannot be reset by changing addresses; a flood can lock one account's sign-in for up to a minute. Held in memory per uvicorn worker</w:t>
             </w:r>
           </w:p>
         </w:tc>
@@ -5664,7 +5742,7 @@
               <w:rPr>
                 <w:sz w:val="16"/>
               </w:rPr>
-              <w:t>Input validation</w:t>
+              <w:t>SQL injection</w:t>
             </w:r>
           </w:p>
         </w:tc>
@@ -5680,7 +5758,7 @@
               <w:rPr>
                 <w:sz w:val="16"/>
               </w:rPr>
-              <w:t xml:space="preserve">Pydantic contracts on every input, bounded lengths and page sizes, decimal precision, </w:t>
+              <w:t xml:space="preserve">Every value is a bind parameter. Dynamic SQL is limited to </w:t>
             </w:r>
             <w:r>
               <w:rPr>
@@ -5688,7 +5766,83 @@
                 <w:color w:val="8B1A1A"/>
                 <w:sz w:val="16"/>
               </w:rPr>
-              <w:t>extra="forbid"</w:t>
+              <w:t>ORDER BY</w:t>
+            </w:r>
+            <w:r>
+              <w:rPr>
+                <w:sz w:val="16"/>
+              </w:rPr>
+              <w:t xml:space="preserve"> fragments chosen from a fixed dict by an enum-validated key, and constant </w:t>
+            </w:r>
+            <w:r>
+              <w:rPr>
+                <w:rFonts w:ascii="Consolas" w:hAnsi="Consolas"/>
+                <w:color w:val="8B1A1A"/>
+                <w:sz w:val="16"/>
+              </w:rPr>
+              <w:t>WHERE</w:t>
+            </w:r>
+            <w:r>
+              <w:rPr>
+                <w:sz w:val="16"/>
+              </w:rPr>
+              <w:t xml:space="preserve"> fragments. Search terms are lower-cased and </w:t>
+            </w:r>
+            <w:r>
+              <w:rPr>
+                <w:rFonts w:ascii="Consolas" w:hAnsi="Consolas"/>
+                <w:color w:val="8B1A1A"/>
+                <w:sz w:val="16"/>
+              </w:rPr>
+              <w:t>%</w:t>
+            </w:r>
+            <w:r>
+              <w:rPr>
+                <w:sz w:val="16"/>
+              </w:rPr>
+              <w:t xml:space="preserve">, </w:t>
+            </w:r>
+            <w:r>
+              <w:rPr>
+                <w:rFonts w:ascii="Consolas" w:hAnsi="Consolas"/>
+                <w:color w:val="8B1A1A"/>
+                <w:sz w:val="16"/>
+              </w:rPr>
+              <w:t>_</w:t>
+            </w:r>
+            <w:r>
+              <w:rPr>
+                <w:sz w:val="16"/>
+              </w:rPr>
+              <w:t xml:space="preserve">, </w:t>
+            </w:r>
+            <w:r>
+              <w:rPr>
+                <w:rFonts w:ascii="Consolas" w:hAnsi="Consolas"/>
+                <w:color w:val="8B1A1A"/>
+                <w:sz w:val="16"/>
+              </w:rPr>
+              <w:t>\</w:t>
+            </w:r>
+            <w:r>
+              <w:rPr>
+                <w:sz w:val="16"/>
+              </w:rPr>
+              <w:t xml:space="preserve"> escaped so wildcards match literally (tested). Import data enters only via </w:t>
+            </w:r>
+            <w:r>
+              <w:rPr>
+                <w:rFonts w:ascii="Consolas" w:hAnsi="Consolas"/>
+                <w:color w:val="8B1A1A"/>
+                <w:sz w:val="16"/>
+              </w:rPr>
+              <w:t>COPY</w:t>
+            </w:r>
+            <w:r>
+              <w:rPr>
+                <w:sz w:val="16"/>
+              </w:rPr>
+              <w:t xml:space="preserve"> and parameters</w:t>
             </w:r>
           </w:p>
         </w:tc>
@@ -5706,7 +5860,7 @@
               <w:rPr>
                 <w:sz w:val="16"/>
               </w:rPr>
-              <w:t>SQL injection</w:t>
+              <w:t>CORS / CSRF</w:t>
             </w:r>
           </w:p>
         </w:tc>
@@ -5722,7 +5876,7 @@
               <w:rPr>
                 <w:sz w:val="16"/>
               </w:rPr>
-              <w:t xml:space="preserve">Every value is a bind parameter. Dynamic SQL is limited to </w:t>
+              <w:t>Same-origin via the rewrite; the API's CORS allow-list (</w:t>
             </w:r>
             <w:r>
               <w:rPr>
@@ -5730,13 +5884,13 @@
                 <w:color w:val="8B1A1A"/>
                 <w:sz w:val="16"/>
               </w:rPr>
-              <w:t>ORDER BY</w:t>
-            </w:r>
-            <w:r>
-              <w:rPr>
-                <w:sz w:val="16"/>
-              </w:rPr>
-              <w:t xml:space="preserve"> fragments chosen from a fixed dict by an enum-validated key, and constant </w:t>
+              <w:t>CORS_ORIGINS</w:t>
+            </w:r>
+            <w:r>
+              <w:rPr>
+                <w:sz w:val="16"/>
+              </w:rPr>
+              <w:t xml:space="preserve">) is only for direct development calls. CSRF relies on </w:t>
             </w:r>
             <w:r>
               <w:rPr>
@@ -5744,13 +5898,26 @@
                 <w:color w:val="8B1A1A"/>
                 <w:sz w:val="16"/>
               </w:rPr>
-              <w:t>WHERE</w:t>
-            </w:r>
-            <w:r>
-              <w:rPr>
-                <w:sz w:val="16"/>
-              </w:rPr>
-              <w:t xml:space="preserve"> fragments. Search terms are lower-cased and </w:t>
+              <w:t>SameSite=Lax</w:t>
+            </w:r>
+            <w:r>
+              <w:rPr>
+                <w:sz w:val="16"/>
+              </w:rPr>
+              <w:t>; JSON bodies also force a preflight cross-origin, but the multipart upload does not, and a same-</w:t>
+            </w:r>
+            <w:r>
+              <w:rPr>
+                <w:i/>
+                <w:sz w:val="16"/>
+              </w:rPr>
+              <w:t>site</w:t>
+            </w:r>
+            <w:r>
+              <w:rPr>
+                <w:sz w:val="16"/>
+              </w:rPr>
+              <w:t xml:space="preserve"> origin is not covered (open: add an </w:t>
             </w:r>
             <w:r>
               <w:rPr>
@@ -5758,55 +5925,13 @@
                 <w:color w:val="8B1A1A"/>
                 <w:sz w:val="16"/>
               </w:rPr>
-              <w:t>%</w:t>
-            </w:r>
-            <w:r>
-              <w:rPr>
-                <w:sz w:val="16"/>
-              </w:rPr>
-              <w:t xml:space="preserve">, </w:t>
-            </w:r>
-            <w:r>
-              <w:rPr>
-                <w:rFonts w:ascii="Consolas" w:hAnsi="Consolas"/>
-                <w:color w:val="8B1A1A"/>
-                <w:sz w:val="16"/>
-              </w:rPr>
-              <w:t>_</w:t>
-            </w:r>
-            <w:r>
-              <w:rPr>
-                <w:sz w:val="16"/>
-              </w:rPr>
-              <w:t xml:space="preserve">, </w:t>
-            </w:r>
-            <w:r>
-              <w:rPr>
-                <w:rFonts w:ascii="Consolas" w:hAnsi="Consolas"/>
-                <w:color w:val="8B1A1A"/>
-                <w:sz w:val="16"/>
-              </w:rPr>
-              <w:t>\</w:t>
-            </w:r>
-            <w:r>
-              <w:rPr>
-                <w:sz w:val="16"/>
-              </w:rPr>
-              <w:t xml:space="preserve"> escaped so wildcards match literally (tested). Import data enters only via </w:t>
-            </w:r>
-            <w:r>
-              <w:rPr>
-                <w:rFonts w:ascii="Consolas" w:hAnsi="Consolas"/>
-                <w:color w:val="8B1A1A"/>
-                <w:sz w:val="16"/>
-              </w:rPr>
-              <w:t>COPY</w:t>
-            </w:r>
-            <w:r>
-              <w:rPr>
-                <w:sz w:val="16"/>
-              </w:rPr>
-              <w:t xml:space="preserve"> and parameters</w:t>
+              <w:t>Origin</w:t>
+            </w:r>
+            <w:r>
+              <w:rPr>
+                <w:sz w:val="16"/>
+              </w:rPr>
+              <w:t xml:space="preserve"> check)</w:t>
             </w:r>
           </w:p>
         </w:tc>
@@ -5824,7 +5949,7 @@
               <w:rPr>
                 <w:sz w:val="16"/>
               </w:rPr>
-              <w:t>CORS / CSRF</w:t>
+              <w:t>Input and uploads</w:t>
             </w:r>
           </w:p>
         </w:tc>
@@ -5840,7 +5965,7 @@
               <w:rPr>
                 <w:sz w:val="16"/>
               </w:rPr>
-              <w:t>Same-origin via the rewrite; the API's CORS allow-list (</w:t>
+              <w:t xml:space="preserve">Pydantic contracts on every input (bounded lengths and page sizes, decimal precision, </w:t>
             </w:r>
             <w:r>
               <w:rPr>
@@ -5848,13 +5973,13 @@
                 <w:color w:val="8B1A1A"/>
                 <w:sz w:val="16"/>
               </w:rPr>
-              <w:t>CORS_ORIGINS</w:t>
-            </w:r>
-            <w:r>
-              <w:rPr>
-                <w:sz w:val="16"/>
-              </w:rPr>
-              <w:t xml:space="preserve">) is only for direct development calls. CSRF relies on </w:t>
+              <w:t>extra="forbid"</w:t>
+            </w:r>
+            <w:r>
+              <w:rPr>
+                <w:sz w:val="16"/>
+              </w:rPr>
+              <w:t xml:space="preserve">). Uploads: ADMIN only; </w:t>
             </w:r>
             <w:r>
               <w:rPr>
@@ -5862,40 +5987,13 @@
                 <w:color w:val="8B1A1A"/>
                 <w:sz w:val="16"/>
               </w:rPr>
-              <w:t>SameSite=Lax</w:t>
-            </w:r>
-            <w:r>
-              <w:rPr>
-                <w:sz w:val="16"/>
-              </w:rPr>
-              <w:t>; JSON bodies also force a preflight cross-origin, but the multipart upload does not, and a same-</w:t>
-            </w:r>
-            <w:r>
-              <w:rPr>
-                <w:i/>
-                <w:sz w:val="16"/>
-              </w:rPr>
-              <w:t>site</w:t>
-            </w:r>
-            <w:r>
-              <w:rPr>
-                <w:sz w:val="16"/>
-              </w:rPr>
-              <w:t xml:space="preserve"> origin is not covered (open: add an </w:t>
-            </w:r>
-            <w:r>
-              <w:rPr>
-                <w:rFonts w:ascii="Consolas" w:hAnsi="Consolas"/>
-                <w:color w:val="8B1A1A"/>
-                <w:sz w:val="16"/>
-              </w:rPr>
-              <w:t>Origin</w:t>
-            </w:r>
-            <w:r>
-              <w:rPr>
-                <w:sz w:val="16"/>
-              </w:rPr>
-              <w:t xml:space="preserve"> check)</w:t>
+              <w:t>.csv</w:t>
+            </w:r>
+            <w:r>
+              <w:rPr>
+                <w:sz w:val="16"/>
+              </w:rPr>
+              <w:t xml:space="preserve"> + content-type allow-list; streamed 25 MB cap (413); strict UTF-8; exact header; field-count check; 64 KiB field cap; basename only; SHA-256 recorded</w:t>
             </w:r>
           </w:p>
         </w:tc>
@@ -5913,7 +6011,7 @@
               <w:rPr>
                 <w:sz w:val="16"/>
               </w:rPr>
-              <w:t>Uploads</w:t>
+              <w:t>Secrets</w:t>
             </w:r>
           </w:p>
         </w:tc>
@@ -5929,7 +6027,7 @@
               <w:rPr>
                 <w:sz w:val="16"/>
               </w:rPr>
-              <w:t xml:space="preserve">ADMIN only; </w:t>
+              <w:t xml:space="preserve">None in Git; </w:t>
             </w:r>
             <w:r>
               <w:rPr>
@@ -5937,13 +6035,83 @@
                 <w:color w:val="8B1A1A"/>
                 <w:sz w:val="16"/>
               </w:rPr>
-              <w:t>.csv</w:t>
-            </w:r>
-            <w:r>
-              <w:rPr>
-                <w:sz w:val="16"/>
-              </w:rPr>
-              <w:t xml:space="preserve"> + content-type allow-list; streamed 25 MB cap (413); strict UTF-8; exact header; field-count check; 64 KiB field cap; basename only; SHA-256 recorded</w:t>
+              <w:t>SecretStr</w:t>
+            </w:r>
+            <w:r>
+              <w:rPr>
+                <w:sz w:val="16"/>
+              </w:rPr>
+              <w:t xml:space="preserve">; </w:t>
+            </w:r>
+            <w:r>
+              <w:rPr>
+                <w:rFonts w:ascii="Consolas" w:hAnsi="Consolas"/>
+                <w:color w:val="8B1A1A"/>
+                <w:sz w:val="16"/>
+              </w:rPr>
+              <w:t>JWT_SECRET</w:t>
+            </w:r>
+            <w:r>
+              <w:rPr>
+                <w:sz w:val="16"/>
+              </w:rPr>
+              <w:t xml:space="preserve"> &gt;= 32 chars; with </w:t>
+            </w:r>
+            <w:r>
+              <w:rPr>
+                <w:rFonts w:ascii="Consolas" w:hAnsi="Consolas"/>
+                <w:color w:val="8B1A1A"/>
+                <w:sz w:val="16"/>
+              </w:rPr>
+              <w:t>ENVIRONMENT=production</w:t>
+            </w:r>
+            <w:r>
+              <w:rPr>
+                <w:sz w:val="16"/>
+              </w:rPr>
+              <w:t xml:space="preserve"> a </w:t>
+            </w:r>
+            <w:r>
+              <w:rPr>
+                <w:rFonts w:ascii="Consolas" w:hAnsi="Consolas"/>
+                <w:color w:val="8B1A1A"/>
+                <w:sz w:val="16"/>
+              </w:rPr>
+              <w:t>_production_guards</w:t>
+            </w:r>
+            <w:r>
+              <w:rPr>
+                <w:sz w:val="16"/>
+              </w:rPr>
+              <w:t xml:space="preserve"> validator refuses published/</w:t>
+            </w:r>
+            <w:r>
+              <w:rPr>
+                <w:rFonts w:ascii="Consolas" w:hAnsi="Consolas"/>
+                <w:color w:val="8B1A1A"/>
+                <w:sz w:val="16"/>
+              </w:rPr>
+              <w:t>local-dev</w:t>
+            </w:r>
+            <w:r>
+              <w:rPr>
+                <w:sz w:val="16"/>
+              </w:rPr>
+              <w:t xml:space="preserve"> secrets and </w:t>
+            </w:r>
+            <w:r>
+              <w:rPr>
+                <w:rFonts w:ascii="Consolas" w:hAnsi="Consolas"/>
+                <w:color w:val="8B1A1A"/>
+                <w:sz w:val="16"/>
+              </w:rPr>
+              <w:t>COOKIE_SECURE=false</w:t>
+            </w:r>
+            <w:r>
+              <w:rPr>
+                <w:sz w:val="16"/>
+              </w:rPr>
+              <w:t xml:space="preserve"> (unit-tested); CI generates throw-away secrets</w:t>
             </w:r>
           </w:p>
         </w:tc>
@@ -5961,7 +6129,7 @@
               <w:rPr>
                 <w:sz w:val="16"/>
               </w:rPr>
-              <w:t>Secrets</w:t>
+              <w:t>Logs and PII</w:t>
             </w:r>
           </w:p>
         </w:tc>
@@ -5977,7 +6145,7 @@
               <w:rPr>
                 <w:sz w:val="16"/>
               </w:rPr>
-              <w:t xml:space="preserve">None in Git; </w:t>
+              <w:t xml:space="preserve">Access log: method, path, status, duration, </w:t>
             </w:r>
             <w:r>
               <w:rPr>
@@ -5985,83 +6153,13 @@
                 <w:color w:val="8B1A1A"/>
                 <w:sz w:val="16"/>
               </w:rPr>
-              <w:t>SecretStr</w:t>
-            </w:r>
-            <w:r>
-              <w:rPr>
-                <w:sz w:val="16"/>
-              </w:rPr>
-              <w:t xml:space="preserve">; </w:t>
-            </w:r>
-            <w:r>
-              <w:rPr>
-                <w:rFonts w:ascii="Consolas" w:hAnsi="Consolas"/>
-                <w:color w:val="8B1A1A"/>
-                <w:sz w:val="16"/>
-              </w:rPr>
-              <w:t>JWT_SECRET</w:t>
-            </w:r>
-            <w:r>
-              <w:rPr>
-                <w:sz w:val="16"/>
-              </w:rPr>
-              <w:t xml:space="preserve"> &gt;= 32 chars; with </w:t>
-            </w:r>
-            <w:r>
-              <w:rPr>
-                <w:rFonts w:ascii="Consolas" w:hAnsi="Consolas"/>
-                <w:color w:val="8B1A1A"/>
-                <w:sz w:val="16"/>
-              </w:rPr>
-              <w:t>ENVIRONMENT=production</w:t>
-            </w:r>
-            <w:r>
-              <w:rPr>
-                <w:sz w:val="16"/>
-              </w:rPr>
-              <w:t xml:space="preserve"> a </w:t>
-            </w:r>
-            <w:r>
-              <w:rPr>
-                <w:rFonts w:ascii="Consolas" w:hAnsi="Consolas"/>
-                <w:color w:val="8B1A1A"/>
-                <w:sz w:val="16"/>
-              </w:rPr>
-              <w:t>_production_guards</w:t>
-            </w:r>
-            <w:r>
-              <w:rPr>
-                <w:sz w:val="16"/>
-              </w:rPr>
-              <w:t xml:space="preserve"> validator refuses published/</w:t>
-            </w:r>
-            <w:r>
-              <w:rPr>
-                <w:rFonts w:ascii="Consolas" w:hAnsi="Consolas"/>
-                <w:color w:val="8B1A1A"/>
-                <w:sz w:val="16"/>
-              </w:rPr>
-              <w:t>local-dev</w:t>
-            </w:r>
-            <w:r>
-              <w:rPr>
-                <w:sz w:val="16"/>
-              </w:rPr>
-              <w:t xml:space="preserve"> secrets and </w:t>
-            </w:r>
-            <w:r>
-              <w:rPr>
-                <w:rFonts w:ascii="Consolas" w:hAnsi="Consolas"/>
-                <w:color w:val="8B1A1A"/>
-                <w:sz w:val="16"/>
-              </w:rPr>
-              <w:t>COOKIE_SECURE=false</w:t>
-            </w:r>
-            <w:r>
-              <w:rPr>
-                <w:sz w:val="16"/>
-              </w:rPr>
-              <w:t xml:space="preserve"> (unit-tested); CI generates throw-away secrets</w:t>
+              <w:t>request_id</w:t>
+            </w:r>
+            <w:r>
+              <w:rPr>
+                <w:sz w:val="16"/>
+              </w:rPr>
+              <w:t>; never query strings, bodies, cookies or passwords. Failed-login events log e-mail and client IP (PII; open: hash in production)</w:t>
             </w:r>
           </w:p>
         </w:tc>
@@ -6079,7 +6177,7 @@
               <w:rPr>
                 <w:sz w:val="16"/>
               </w:rPr>
-              <w:t>Logs and PII</w:t>
+              <w:t>Network, images, client IP</w:t>
             </w:r>
           </w:p>
         </w:tc>
@@ -6095,7 +6193,7 @@
               <w:rPr>
                 <w:sz w:val="16"/>
               </w:rPr>
-              <w:t xml:space="preserve">Access log has method, path, status, duration, </w:t>
+              <w:t xml:space="preserve">Ports bound to 127.0.0.1; non-root containers; Caddy adds HSTS/nosniff/frame-deny; Trivy in CI. The Next.js rewrite passes a client-supplied </w:t>
             </w:r>
             <w:r>
               <w:rPr>
@@ -6103,47 +6201,13 @@
                 <w:color w:val="8B1A1A"/>
                 <w:sz w:val="16"/>
               </w:rPr>
-              <w:t>request_id</w:t>
-            </w:r>
-            <w:r>
-              <w:rPr>
-                <w:sz w:val="16"/>
-              </w:rPr>
-              <w:t>; no query strings, bodies, cookies or passwords. Failed-login events log the attempted e-mail and client IP (PII; open: hash or restrict in production). Data is synthetic</w:t>
-            </w:r>
-          </w:p>
-        </w:tc>
-      </w:tr>
-      <w:tr>
-        <w:tc>
-          <w:tcPr>
-            <w:tcW w:type="dxa" w:w="3282"/>
-          </w:tcPr>
-          <w:p>
-            <w:pPr>
-              <w:spacing w:after="0"/>
-            </w:pPr>
-            <w:r>
-              <w:rPr>
-                <w:sz w:val="16"/>
-              </w:rPr>
-              <w:t>Network, images, client IP</w:t>
-            </w:r>
-          </w:p>
-        </w:tc>
-        <w:tc>
-          <w:tcPr>
-            <w:tcW w:type="dxa" w:w="6942"/>
-          </w:tcPr>
-          <w:p>
-            <w:pPr>
-              <w:spacing w:after="0"/>
-            </w:pPr>
-            <w:r>
-              <w:rPr>
-                <w:sz w:val="16"/>
-              </w:rPr>
-              <w:t xml:space="preserve">Ports bound to 127.0.0.1; non-root containers; Caddy adds HSTS/nosniff/frame-deny; Trivy in CI. uvicorn </w:t>
+              <w:t>X-Forwarded-For</w:t>
+            </w:r>
+            <w:r>
+              <w:rPr>
+                <w:sz w:val="16"/>
+              </w:rPr>
+              <w:t xml:space="preserve"> through verbatim, so the api trusts forwarded headers only from </w:t>
             </w:r>
             <w:r>
               <w:rPr>
@@ -6151,27 +6215,13 @@
                 <w:color w:val="8B1A1A"/>
                 <w:sz w:val="16"/>
               </w:rPr>
-              <w:t>--proxy-headers</w:t>
-            </w:r>
-            <w:r>
-              <w:rPr>
-                <w:sz w:val="16"/>
-              </w:rPr>
-              <w:t xml:space="preserve"> with </w:t>
-            </w:r>
-            <w:r>
-              <w:rPr>
-                <w:rFonts w:ascii="Consolas" w:hAnsi="Consolas"/>
-                <w:color w:val="8B1A1A"/>
-                <w:sz w:val="16"/>
-              </w:rPr>
-              <w:t>FORWARDED_ALLOW_IPS="*"</w:t>
-            </w:r>
-            <w:r>
-              <w:rPr>
-                <w:sz w:val="16"/>
-              </w:rPr>
-              <w:t xml:space="preserve"> (api reachable only on the private network) so the rate-limit key and logs see the real client IP</w:t>
+              <w:t>FORWARDED_ALLOW_IPS</w:t>
+            </w:r>
+            <w:r>
+              <w:rPr>
+                <w:sz w:val="16"/>
+              </w:rPr>
+              <w:t xml:space="preserve"> (default 127.0.0.1). Behind the web proxy the API therefore sees the web container as the client, and the (IP, e-mail) budget acts per account. Real client IPs need an edge proxy that overwrites the header (production load balancer)</w:t>
             </w:r>
           </w:p>
         </w:tc>
@@ -6222,7 +6272,7 @@
         <w:t>SELECT 1</w:t>
       </w:r>
       <w:r>
-        <w:t xml:space="preserve"> through the pool (503 if the DB is down). It drives the image </w:t>
+        <w:t xml:space="preserve"> (503 if the DB is down); it drives the image </w:t>
       </w:r>
       <w:r>
         <w:rPr>
@@ -6232,7 +6282,7 @@
         <w:t>HEALTHCHECK</w:t>
       </w:r>
       <w:r>
-        <w:t xml:space="preserve"> and compose start ordering; production would split liveness from readiness.</w:t>
+        <w:t xml:space="preserve"> and compose start order. Production would split liveness from readiness.</w:t>
       </w:r>
     </w:p>
     <w:p>
@@ -6502,7 +6552,7 @@
         <w:t>pg_dump -Fc</w:t>
       </w:r>
       <w:r>
-        <w:t>; production uses managed automated backups with WAL-based PITR and periodic restore drills.</w:t>
+        <w:t>; in production managed backups with WAL-based PITR and periodic restore drills.</w:t>
       </w:r>
     </w:p>
     <w:p>
@@ -6518,10 +6568,10 @@
         <w:rPr>
           <w:b/>
         </w:rPr>
-        <w:t>Trade-offs taken</w:t>
-      </w:r>
-      <w:r>
-        <w:t xml:space="preserve"> (full ADRs in </w:t>
+        <w:t>Trade-offs</w:t>
+      </w:r>
+      <w:r>
+        <w:t xml:space="preserve"> (ADRs in </w:t>
       </w:r>
       <w:r>
         <w:rPr>
@@ -6531,7 +6581,7 @@
         <w:t>DECISIONS.md</w:t>
       </w:r>
       <w:r>
-        <w:t xml:space="preserve">): natural keys give readable data and idempotency by PK but make re-keying costly; </w:t>
+        <w:t xml:space="preserve">): natural keys (readable, idempotent; costly re-keying); </w:t>
       </w:r>
       <w:r>
         <w:rPr>
@@ -6541,7 +6591,7 @@
         <w:t>VARCHAR + CHECK</w:t>
       </w:r>
       <w:r>
-        <w:t xml:space="preserve"> makes vocabulary changes transactional but duplicates lists in Python enums; plain views are always fresh but recompute whole-table aggregates; offset pagination is simple but linear at depth; the cookie JWT keeps tokens out of JavaScript but costs a user lookup per request and needs CSRF care; the synchronous import holds a request for the whole file.</w:t>
+        <w:t xml:space="preserve"> (transactional vocabulary changes; lists duplicated in enums); plain views (fresh; recomputed per request); offset paging (simple; linear at depth); cookie JWT (no token in JS; per-request user lookup, CSRF care); synchronous import (atomic; holds the request).</w:t>
       </w:r>
     </w:p>
     <w:p>
@@ -6549,10 +6599,10 @@
         <w:rPr>
           <w:b/>
         </w:rPr>
-        <w:t>Scale limits (measured).</w:t>
-      </w:r>
-      <w:r>
-        <w:t xml:space="preserve"> Every endpoint takes &lt; 5 ms of DB time on the supplied data. At 100k customers / 3M transactions: ledger page 1.3 ms; customer list ~0.5–1.1 s (AUM computed for all customers before paging); a 50k-transaction customer 129 ms (page 1) to 293 ms (page 2,000); monthly flows 1.3 s. The login limiter is in-process, so each worker and replica counts separately.</w:t>
+        <w:t>Scale limits (measured, `query-plans.md`):</w:t>
+      </w:r>
+      <w:r>
+        <w:t xml:space="preserve"> &lt; 5 ms per endpoint on the supplied data; at 3M transactions the customer list (0.5–1.1 s), deep ledger pages (293 ms) and monthly flows (1.3 s) are the bottlenecks. Login budgets are in-process, per worker and replica.</w:t>
       </w:r>
     </w:p>
     <w:p>
@@ -6663,7 +6713,7 @@
       <w:r>
         <w:drawing>
           <wp:inline xmlns:a="http://schemas.openxmlformats.org/drawingml/2006/main" xmlns:pic="http://schemas.openxmlformats.org/drawingml/2006/picture">
-            <wp:extent cx="5502004" cy="4572000"/>
+            <wp:extent cx="5244265" cy="4572000"/>
             <wp:docPr id="9" name="Picture 9"/>
             <wp:cNvGraphicFramePr>
               <a:graphicFrameLocks noChangeAspect="1"/>
@@ -6684,7 +6734,7 @@
                   <pic:spPr>
                     <a:xfrm>
                       <a:off x="0" y="0"/>
-                      <a:ext cx="5502004" cy="4572000"/>
+                      <a:ext cx="5244265" cy="4572000"/>
                     </a:xfrm>
                     <a:prstGeom prst="rect"/>
                   </pic:spPr>

</xml_diff>